<commit_message>
Ocultar del todo la matriz de documentos en Word cuando se califica con puntaje
El título fijo 'Matriz Cumple o No cumple — entrega de documentos' y su tabla quedaban en la plantilla aunque no hubiera filas (docs:[]) cuando el proceso usa el modo 'Con puntaje'. Se envolvió ese bloque (título + tabla) en un condicional {#docsGate}...{/docsGate} en la plantilla de puntos (python-docx, sin tocar el resto), y la app manda docsGate:true/false según el modo elegido. Verificado con docxtemplater+mammoth y con el generador real de la app (Playwright) en los dos modos: con Cumple/No cumple se ve igual que antes, con puntaje el bloque desaparece por completo y no quedan llaves huérfanas.
</commit_message>
<xml_diff>
--- a/calificacion/plantillas/Acta_de_adjudicacion_puntos.docx
+++ b/calificacion/plantillas/Acta_de_adjudicacion_puntos.docx
@@ -2785,6 +2785,15 @@
       </w:r>
     </w:p>
     <w:p>
+      <w:r>
+        <w:rPr>
+          <w:rFonts w:ascii="Titillium Web" w:hAnsi="Titillium Web"/>
+          <w:sz w:val="22"/>
+        </w:rPr>
+        <w:t>{#docsGate}</w:t>
+      </w:r>
+    </w:p>
+    <w:p>
       <w:pPr>
         <w:spacing w:line="264" w:lineRule="auto"/>
         <w:jc w:val="both"/>
@@ -3160,6 +3169,15 @@
           <w:szCs w:val="22"/>
         </w:rPr>
       </w:pPr>
+    </w:p>
+    <w:p>
+      <w:r>
+        <w:rPr>
+          <w:rFonts w:ascii="Titillium Web" w:hAnsi="Titillium Web"/>
+          <w:sz w:val="22"/>
+        </w:rPr>
+        <w:t>{/docsGate}</w:t>
+      </w:r>
     </w:p>
     <w:p>
       <w:pPr>

</xml_diff>